<commit_message>
Methode ConvertRBrichtext aus onMailMerge entfernt
</commit_message>
<xml_diff>
--- a/Zeugnisse-Sek-2-Versiongeschichte.docx
+++ b/Zeugnisse-Sek-2-Versiongeschichte.docx
@@ -1,6 +1,6 @@
 
 <file path=word/document.xml><?xml version="1.0" encoding="utf-8"?>
-<w:document xmlns:wpc="http://schemas.microsoft.com/office/word/2010/wordprocessingCanvas" xmlns:cx="http://schemas.microsoft.com/office/drawing/2014/chartex" xmlns:cx1="http://schemas.microsoft.com/office/drawing/2015/9/8/chartex" xmlns:cx2="http://schemas.microsoft.com/office/drawing/2015/10/21/chartex" xmlns:cx3="http://schemas.microsoft.com/office/drawing/2016/5/9/chartex" xmlns:cx4="http://schemas.microsoft.com/office/drawing/2016/5/10/chartex" xmlns:cx5="http://schemas.microsoft.com/office/drawing/2016/5/11/chartex" xmlns:cx6="http://schemas.microsoft.com/office/drawing/2016/5/12/chartex" xmlns:cx7="http://schemas.microsoft.com/office/drawing/2016/5/13/chartex" xmlns:cx8="http://schemas.microsoft.com/office/drawing/2016/5/14/chartex" xmlns:mc="http://schemas.openxmlformats.org/markup-compatibility/2006" xmlns:aink="http://schemas.microsoft.com/office/drawing/2016/ink" xmlns:am3d="http://schemas.microsoft.com/office/drawing/2017/model3d" xmlns:o="urn:schemas-microsoft-com:office:office" xmlns:oel="http://schemas.microsoft.com/office/2019/extlst" xmlns:r="http://schemas.openxmlformats.org/officeDocument/2006/relationships" xmlns:m="http://schemas.openxmlformats.org/officeDocument/2006/math" xmlns:v="urn:schemas-microsoft-com:vml" xmlns:wp14="http://schemas.microsoft.com/office/word/2010/wordprocessingDrawing" xmlns:wp="http://schemas.openxmlformats.org/drawingml/2006/wordprocessingDrawing" xmlns:w10="urn:schemas-microsoft-com:office:word" xmlns:w="http://schemas.openxmlformats.org/wordprocessingml/2006/main" xmlns:w14="http://schemas.microsoft.com/office/word/2010/wordml" xmlns:w15="http://schemas.microsoft.com/office/word/2012/wordml" xmlns:w16cex="http://schemas.microsoft.com/office/word/2018/wordml/cex" xmlns:w16cid="http://schemas.microsoft.com/office/word/2016/wordml/cid" xmlns:w16="http://schemas.microsoft.com/office/word/2018/wordml" xmlns:w16sdtdh="http://schemas.microsoft.com/office/word/2020/wordml/sdtdatahash" xmlns:w16se="http://schemas.microsoft.com/office/word/2015/wordml/symex" xmlns:wpg="http://schemas.microsoft.com/office/word/2010/wordprocessingGroup" xmlns:wpi="http://schemas.microsoft.com/office/word/2010/wordprocessingInk" xmlns:wne="http://schemas.microsoft.com/office/word/2006/wordml" xmlns:wps="http://schemas.microsoft.com/office/word/2010/wordprocessingShape" mc:Ignorable="w14 w15 w16se w16cid w16 w16cex w16sdtdh wp14">
+<w:document xmlns:wpc="http://schemas.microsoft.com/office/word/2010/wordprocessingCanvas" xmlns:cx="http://schemas.microsoft.com/office/drawing/2014/chartex" xmlns:cx1="http://schemas.microsoft.com/office/drawing/2015/9/8/chartex" xmlns:cx2="http://schemas.microsoft.com/office/drawing/2015/10/21/chartex" xmlns:cx3="http://schemas.microsoft.com/office/drawing/2016/5/9/chartex" xmlns:cx4="http://schemas.microsoft.com/office/drawing/2016/5/10/chartex" xmlns:cx5="http://schemas.microsoft.com/office/drawing/2016/5/11/chartex" xmlns:cx6="http://schemas.microsoft.com/office/drawing/2016/5/12/chartex" xmlns:cx7="http://schemas.microsoft.com/office/drawing/2016/5/13/chartex" xmlns:cx8="http://schemas.microsoft.com/office/drawing/2016/5/14/chartex" xmlns:mc="http://schemas.openxmlformats.org/markup-compatibility/2006" xmlns:aink="http://schemas.microsoft.com/office/drawing/2016/ink" xmlns:am3d="http://schemas.microsoft.com/office/drawing/2017/model3d" xmlns:o="urn:schemas-microsoft-com:office:office" xmlns:oel="http://schemas.microsoft.com/office/2019/extlst" xmlns:r="http://schemas.openxmlformats.org/officeDocument/2006/relationships" xmlns:m="http://schemas.openxmlformats.org/officeDocument/2006/math" xmlns:v="urn:schemas-microsoft-com:vml" xmlns:wp14="http://schemas.microsoft.com/office/word/2010/wordprocessingDrawing" xmlns:wp="http://schemas.openxmlformats.org/drawingml/2006/wordprocessingDrawing" xmlns:w10="urn:schemas-microsoft-com:office:word" xmlns:w="http://schemas.openxmlformats.org/wordprocessingml/2006/main" xmlns:w14="http://schemas.microsoft.com/office/word/2010/wordml" xmlns:w15="http://schemas.microsoft.com/office/word/2012/wordml" xmlns:w16cex="http://schemas.microsoft.com/office/word/2018/wordml/cex" xmlns:w16cid="http://schemas.microsoft.com/office/word/2016/wordml/cid" xmlns:w16="http://schemas.microsoft.com/office/word/2018/wordml" xmlns:w16du="http://schemas.microsoft.com/office/word/2023/wordml/word16du" xmlns:w16sdtdh="http://schemas.microsoft.com/office/word/2020/wordml/sdtdatahash" xmlns:w16sdtfl="http://schemas.microsoft.com/office/word/2024/wordml/sdtformatlock" xmlns:w16se="http://schemas.microsoft.com/office/word/2015/wordml/symex" xmlns:wpg="http://schemas.microsoft.com/office/word/2010/wordprocessingGroup" xmlns:wpi="http://schemas.microsoft.com/office/word/2010/wordprocessingInk" xmlns:wne="http://schemas.microsoft.com/office/word/2006/wordml" xmlns:wps="http://schemas.microsoft.com/office/word/2010/wordprocessingShape" mc:Ignorable="w14 w15 w16se w16cid w16 w16cex w16sdtdh w16sdtfl w16du wp14">
   <w:body>
     <w:p>
       <w:pPr>
@@ -45,6 +45,147 @@
           <w:b/>
           <w:sz w:val="24"/>
         </w:rPr>
+        <w:t>13</w:t>
+      </w:r>
+      <w:r>
+        <w:rPr>
+          <w:rFonts w:ascii="Calibri" w:eastAsia="Calibri" w:hAnsi="Calibri" w:cs="Calibri"/>
+          <w:b/>
+          <w:sz w:val="24"/>
+        </w:rPr>
+        <w:t>.0</w:t>
+      </w:r>
+      <w:r>
+        <w:rPr>
+          <w:rFonts w:ascii="Calibri" w:eastAsia="Calibri" w:hAnsi="Calibri" w:cs="Calibri"/>
+          <w:b/>
+          <w:sz w:val="24"/>
+        </w:rPr>
+        <w:t>3</w:t>
+      </w:r>
+      <w:r>
+        <w:rPr>
+          <w:rFonts w:ascii="Calibri" w:eastAsia="Calibri" w:hAnsi="Calibri" w:cs="Calibri"/>
+          <w:b/>
+          <w:sz w:val="24"/>
+        </w:rPr>
+        <w:t>.202</w:t>
+      </w:r>
+      <w:r>
+        <w:rPr>
+          <w:rFonts w:ascii="Calibri" w:eastAsia="Calibri" w:hAnsi="Calibri" w:cs="Calibri"/>
+          <w:b/>
+          <w:sz w:val="24"/>
+        </w:rPr>
+        <w:t>5</w:t>
+      </w:r>
+      <w:r>
+        <w:rPr>
+          <w:rFonts w:ascii="Calibri" w:eastAsia="Calibri" w:hAnsi="Calibri" w:cs="Calibri"/>
+          <w:b/>
+          <w:sz w:val="24"/>
+        </w:rPr>
+        <w:t xml:space="preserve"> </w:t>
+      </w:r>
+    </w:p>
+    <w:p>
+      <w:pPr>
+        <w:pStyle w:val="Listenabsatz"/>
+        <w:numPr>
+          <w:ilvl w:val="0"/>
+          <w:numId w:val="9"/>
+        </w:numPr>
+        <w:rPr>
+          <w:rFonts w:ascii="Calibri" w:eastAsia="Calibri" w:hAnsi="Calibri" w:cs="Calibri"/>
+          <w:b/>
+          <w:sz w:val="24"/>
+        </w:rPr>
+      </w:pPr>
+      <w:r>
+        <w:rPr>
+          <w:rFonts w:ascii="Calibri" w:eastAsia="Calibri" w:hAnsi="Calibri" w:cs="Calibri"/>
+        </w:rPr>
+        <w:t xml:space="preserve">Anlage </w:t>
+      </w:r>
+      <w:r>
+        <w:rPr>
+          <w:rFonts w:ascii="Calibri" w:eastAsia="Calibri" w:hAnsi="Calibri" w:cs="Calibri"/>
+        </w:rPr>
+        <w:t xml:space="preserve">10, 11, 17 und </w:t>
+      </w:r>
+      <w:r>
+        <w:rPr>
+          <w:rFonts w:ascii="Calibri" w:eastAsia="Calibri" w:hAnsi="Calibri" w:cs="Calibri"/>
+        </w:rPr>
+        <w:t>18</w:t>
+      </w:r>
+      <w:r>
+        <w:rPr>
+          <w:rFonts w:ascii="Calibri" w:eastAsia="Calibri" w:hAnsi="Calibri" w:cs="Calibri"/>
+        </w:rPr>
+        <w:t xml:space="preserve">: Im Ereignis </w:t>
+      </w:r>
+      <w:proofErr w:type="spellStart"/>
+      <w:r>
+        <w:rPr>
+          <w:rFonts w:ascii="Calibri" w:eastAsia="Calibri" w:hAnsi="Calibri" w:cs="Calibri"/>
+        </w:rPr>
+        <w:t>BrieftextOnMailMerge</w:t>
+      </w:r>
+      <w:proofErr w:type="spellEnd"/>
+      <w:r>
+        <w:rPr>
+          <w:rFonts w:ascii="Calibri" w:eastAsia="Calibri" w:hAnsi="Calibri" w:cs="Calibri"/>
+        </w:rPr>
+        <w:t xml:space="preserve"> wurde die überflüssige Methode </w:t>
+      </w:r>
+      <w:r>
+        <w:rPr>
+          <w:rFonts w:ascii="Calibri" w:eastAsia="Calibri" w:hAnsi="Calibri" w:cs="Calibri"/>
+        </w:rPr>
+        <w:t xml:space="preserve"> </w:t>
+      </w:r>
+      <w:proofErr w:type="spellStart"/>
+      <w:r>
+        <w:rPr>
+          <w:rFonts w:ascii="Calibri" w:eastAsia="Calibri" w:hAnsi="Calibri" w:cs="Calibri"/>
+        </w:rPr>
+        <w:t>ConvertRBrichtext</w:t>
+      </w:r>
+      <w:proofErr w:type="spellEnd"/>
+      <w:r>
+        <w:rPr>
+          <w:rFonts w:ascii="Calibri" w:eastAsia="Calibri" w:hAnsi="Calibri" w:cs="Calibri"/>
+        </w:rPr>
+        <w:t>, die im Reportgenerator für Schild3 nicht weiter unterstützt wird, entfernt. Dadurch wird eine Kompatibilität</w:t>
+      </w:r>
+      <w:r>
+        <w:rPr>
+          <w:rFonts w:ascii="Calibri" w:eastAsia="Calibri" w:hAnsi="Calibri" w:cs="Calibri"/>
+        </w:rPr>
+        <w:t xml:space="preserve"> der Anlagen</w:t>
+      </w:r>
+      <w:r>
+        <w:rPr>
+          <w:rFonts w:ascii="Calibri" w:eastAsia="Calibri" w:hAnsi="Calibri" w:cs="Calibri"/>
+        </w:rPr>
+        <w:t xml:space="preserve"> für Schild3 gewährleistet.</w:t>
+      </w:r>
+    </w:p>
+    <w:p>
+      <w:pPr>
+        <w:rPr>
+          <w:rFonts w:ascii="Calibri" w:eastAsia="Calibri" w:hAnsi="Calibri" w:cs="Calibri"/>
+          <w:b/>
+          <w:sz w:val="24"/>
+        </w:rPr>
+      </w:pPr>
+      <w:r>
+        <w:rPr>
+          <w:rFonts w:ascii="Calibri" w:eastAsia="Calibri" w:hAnsi="Calibri" w:cs="Calibri"/>
+          <w:b/>
+          <w:sz w:val="24"/>
+        </w:rPr>
         <w:t>17.04.2024</w:t>
       </w:r>
       <w:r>
@@ -344,6 +485,7 @@
           <w:rFonts w:ascii="Calibri" w:eastAsia="Calibri" w:hAnsi="Calibri" w:cs="Calibri"/>
           <w:sz w:val="24"/>
         </w:rPr>
+        <w:lastRenderedPageBreak/>
         <w:t>Fehlerbehebung Anlage 05b: Bei zwei unterschiedlichen Vertiefungsfächern in der Qualifikationsphase kam es zu einer Doppelausgabe der Anzahl der Vertiefungsfächer</w:t>
       </w:r>
     </w:p>
@@ -384,272 +526,359 @@
           <w:rFonts w:ascii="Calibri" w:eastAsia="Calibri" w:hAnsi="Calibri" w:cs="Calibri"/>
           <w:sz w:val="24"/>
         </w:rPr>
+        <w:t>Anpassung des Parameters „K“ für die Quelle des Infoblocks in den Anlagen 10, 11, 17 und 18. Dort werden nun auch zusätzlich die Zeilenbeschriftungen des Infoblocks ausgeblendet.</w:t>
+      </w:r>
+    </w:p>
+    <w:p>
+      <w:pPr>
+        <w:numPr>
+          <w:ilvl w:val="0"/>
+          <w:numId w:val="6"/>
+        </w:numPr>
+        <w:ind w:left="720" w:hanging="360"/>
+        <w:rPr>
+          <w:rFonts w:ascii="Calibri" w:eastAsia="Calibri" w:hAnsi="Calibri" w:cs="Calibri"/>
+          <w:sz w:val="24"/>
+        </w:rPr>
+      </w:pPr>
+      <w:r>
+        <w:rPr>
+          <w:rFonts w:ascii="Calibri" w:eastAsia="Calibri" w:hAnsi="Calibri" w:cs="Calibri"/>
+          <w:sz w:val="24"/>
+        </w:rPr>
+        <w:t>Korrekturen an der Formatierung und den Abständen auf den Seiten 2 und 3 der Anlage 12. Betroffenen waren die Überschriften der Aufgabenfelder, Vertiefungs- und Projektkurse und die besondere Lernleistung, insbesondere bei mehrzeiligen Themen.</w:t>
+      </w:r>
+    </w:p>
+    <w:p>
+      <w:pPr>
+        <w:rPr>
+          <w:rFonts w:ascii="Calibri" w:eastAsia="Calibri" w:hAnsi="Calibri" w:cs="Calibri"/>
+          <w:b/>
+          <w:sz w:val="24"/>
+        </w:rPr>
+      </w:pPr>
+      <w:r>
+        <w:rPr>
+          <w:rFonts w:ascii="Calibri" w:eastAsia="Calibri" w:hAnsi="Calibri" w:cs="Calibri"/>
+          <w:b/>
+          <w:sz w:val="24"/>
+        </w:rPr>
+        <w:t>04.04.2022</w:t>
+      </w:r>
+    </w:p>
+    <w:p>
+      <w:pPr>
+        <w:numPr>
+          <w:ilvl w:val="0"/>
+          <w:numId w:val="7"/>
+        </w:numPr>
+        <w:ind w:left="720" w:hanging="360"/>
+        <w:rPr>
+          <w:rFonts w:ascii="Calibri" w:eastAsia="Calibri" w:hAnsi="Calibri" w:cs="Calibri"/>
+          <w:sz w:val="24"/>
+        </w:rPr>
+      </w:pPr>
+      <w:r>
+        <w:rPr>
+          <w:rFonts w:ascii="Calibri" w:eastAsia="Calibri" w:hAnsi="Calibri" w:cs="Calibri"/>
+          <w:sz w:val="24"/>
+        </w:rPr>
+        <w:t>Fehlerkorrekturen bei der Ausgabe der Jahrgangsstufen an einer Gesamtschule in den Anlagen 7 und 16a</w:t>
+      </w:r>
+    </w:p>
+    <w:p>
+      <w:pPr>
+        <w:numPr>
+          <w:ilvl w:val="0"/>
+          <w:numId w:val="7"/>
+        </w:numPr>
+        <w:ind w:left="720" w:hanging="360"/>
+        <w:rPr>
+          <w:rFonts w:ascii="Calibri" w:eastAsia="Calibri" w:hAnsi="Calibri" w:cs="Calibri"/>
+          <w:sz w:val="24"/>
+        </w:rPr>
+      </w:pPr>
+      <w:r>
+        <w:rPr>
+          <w:rFonts w:ascii="Calibri" w:eastAsia="Calibri" w:hAnsi="Calibri" w:cs="Calibri"/>
+          <w:sz w:val="24"/>
+        </w:rPr>
+        <w:t>Fehlerkorrekturen der Fußnoten in den Anlagen 3, 4, 7 und 12</w:t>
+      </w:r>
+    </w:p>
+    <w:p>
+      <w:pPr>
+        <w:numPr>
+          <w:ilvl w:val="0"/>
+          <w:numId w:val="7"/>
+        </w:numPr>
+        <w:ind w:left="720" w:hanging="360"/>
+        <w:rPr>
+          <w:rFonts w:ascii="Calibri" w:eastAsia="Calibri" w:hAnsi="Calibri" w:cs="Calibri"/>
+          <w:sz w:val="24"/>
+        </w:rPr>
+      </w:pPr>
+      <w:r>
+        <w:rPr>
+          <w:rFonts w:ascii="Calibri" w:eastAsia="Calibri" w:hAnsi="Calibri" w:cs="Calibri"/>
+          <w:sz w:val="24"/>
+        </w:rPr>
+        <w:t>Fehlerkorrektur der Erkennung volljähriger Schülerinnen und Schüler in den Anlagen 10, 11, 17, 18</w:t>
+      </w:r>
+    </w:p>
+    <w:p>
+      <w:pPr>
+        <w:numPr>
+          <w:ilvl w:val="0"/>
+          <w:numId w:val="7"/>
+        </w:numPr>
+        <w:ind w:left="720" w:hanging="360"/>
+        <w:rPr>
+          <w:rFonts w:ascii="Calibri" w:eastAsia="Calibri" w:hAnsi="Calibri" w:cs="Calibri"/>
+          <w:sz w:val="24"/>
+        </w:rPr>
+      </w:pPr>
+      <w:r>
+        <w:rPr>
+          <w:rFonts w:ascii="Calibri" w:eastAsia="Calibri" w:hAnsi="Calibri" w:cs="Calibri"/>
+          <w:sz w:val="24"/>
+        </w:rPr>
+        <w:t>Fehlerkorrektur der Zeilenumbrüche in der INI-Datei</w:t>
+      </w:r>
+    </w:p>
+    <w:p>
+      <w:pPr>
+        <w:numPr>
+          <w:ilvl w:val="0"/>
+          <w:numId w:val="7"/>
+        </w:numPr>
+        <w:ind w:left="720" w:hanging="360"/>
+        <w:rPr>
+          <w:rFonts w:ascii="Calibri" w:eastAsia="Calibri" w:hAnsi="Calibri" w:cs="Calibri"/>
+          <w:sz w:val="24"/>
+        </w:rPr>
+      </w:pPr>
+      <w:r>
+        <w:rPr>
+          <w:rFonts w:ascii="Calibri" w:eastAsia="Calibri" w:hAnsi="Calibri" w:cs="Calibri"/>
+          <w:sz w:val="24"/>
+        </w:rPr>
+        <w:t xml:space="preserve">Anpassung der Standard-INI-Werte auf N für </w:t>
+      </w:r>
+      <w:proofErr w:type="spellStart"/>
+      <w:r>
+        <w:rPr>
+          <w:rFonts w:ascii="Calibri" w:eastAsia="Calibri" w:hAnsi="Calibri" w:cs="Calibri"/>
+          <w:sz w:val="24"/>
+        </w:rPr>
+        <w:t>UnterschriftenMitStvKlassenlehrer</w:t>
+      </w:r>
+      <w:proofErr w:type="spellEnd"/>
+      <w:r>
+        <w:rPr>
+          <w:rFonts w:ascii="Calibri" w:eastAsia="Calibri" w:hAnsi="Calibri" w:cs="Calibri"/>
+          <w:sz w:val="24"/>
+        </w:rPr>
+        <w:t xml:space="preserve">  und </w:t>
+      </w:r>
+      <w:proofErr w:type="spellStart"/>
+      <w:r>
+        <w:rPr>
+          <w:rFonts w:ascii="Calibri" w:eastAsia="Calibri" w:hAnsi="Calibri" w:cs="Calibri"/>
+          <w:sz w:val="24"/>
+        </w:rPr>
+        <w:t>ZeugnisMitRand</w:t>
+      </w:r>
+      <w:proofErr w:type="spellEnd"/>
+      <w:r>
+        <w:rPr>
+          <w:rFonts w:ascii="Calibri" w:eastAsia="Calibri" w:hAnsi="Calibri" w:cs="Calibri"/>
+          <w:sz w:val="24"/>
+        </w:rPr>
+        <w:t xml:space="preserve">. Ebenso wird </w:t>
+      </w:r>
+      <w:proofErr w:type="spellStart"/>
+      <w:r>
+        <w:rPr>
+          <w:rFonts w:ascii="Calibri" w:eastAsia="Calibri" w:hAnsi="Calibri" w:cs="Calibri"/>
+          <w:sz w:val="24"/>
+        </w:rPr>
+        <w:t>ZeugnisdatumQuelle</w:t>
+      </w:r>
+      <w:proofErr w:type="spellEnd"/>
+      <w:r>
+        <w:rPr>
+          <w:rFonts w:ascii="Calibri" w:eastAsia="Calibri" w:hAnsi="Calibri" w:cs="Calibri"/>
+          <w:sz w:val="24"/>
+        </w:rPr>
+        <w:t xml:space="preserve"> auf I gesetzt für Anlagen 5b, 10, 11, 17, 18</w:t>
+      </w:r>
+    </w:p>
+    <w:p>
+      <w:pPr>
+        <w:numPr>
+          <w:ilvl w:val="0"/>
+          <w:numId w:val="7"/>
+        </w:numPr>
+        <w:ind w:left="720" w:hanging="360"/>
+        <w:rPr>
+          <w:rFonts w:ascii="Calibri" w:eastAsia="Calibri" w:hAnsi="Calibri" w:cs="Calibri"/>
+          <w:sz w:val="24"/>
+        </w:rPr>
+      </w:pPr>
+      <w:r>
+        <w:rPr>
+          <w:rFonts w:ascii="Calibri" w:eastAsia="Calibri" w:hAnsi="Calibri" w:cs="Calibri"/>
+          <w:sz w:val="24"/>
+        </w:rPr>
+        <w:t>In allen Anlagen wurden die Unterschriftenfunktionen erweitert. So kann jetzt in der INI ein senkrechter Strich „|“ in die Unterschriftentexte eingefügt werden, der als Zeilenumbruch beim Ausdruck interpretiert wird.</w:t>
+      </w:r>
+    </w:p>
+    <w:p>
+      <w:pPr>
+        <w:numPr>
+          <w:ilvl w:val="0"/>
+          <w:numId w:val="7"/>
+        </w:numPr>
+        <w:ind w:left="720" w:hanging="360"/>
+        <w:rPr>
+          <w:rFonts w:ascii="Calibri" w:eastAsia="Calibri" w:hAnsi="Calibri" w:cs="Calibri"/>
+          <w:sz w:val="24"/>
+        </w:rPr>
+      </w:pPr>
+      <w:r>
+        <w:rPr>
+          <w:rFonts w:ascii="Calibri" w:eastAsia="Calibri" w:hAnsi="Calibri" w:cs="Calibri"/>
+          <w:sz w:val="24"/>
+        </w:rPr>
+        <w:t>Für die Unterschriftenquelle des ZAA-Vorsitzes wurde der alte INI-Parameterwert „I“ durch „T“ ersetzt und damit die gleiche Funktionalität implementiert wie beim Beratungslehrer (Abfragebox und Eingabemöglichkeit eines Lehrerkürzels).</w:t>
+      </w:r>
+    </w:p>
+    <w:p>
+      <w:pPr>
+        <w:numPr>
+          <w:ilvl w:val="0"/>
+          <w:numId w:val="7"/>
+        </w:numPr>
+        <w:ind w:left="720" w:hanging="360"/>
+        <w:rPr>
+          <w:rFonts w:ascii="Calibri" w:eastAsia="Calibri" w:hAnsi="Calibri" w:cs="Calibri"/>
+          <w:sz w:val="24"/>
+        </w:rPr>
+      </w:pPr>
+      <w:r>
+        <w:rPr>
+          <w:rFonts w:ascii="Calibri" w:eastAsia="Calibri" w:hAnsi="Calibri" w:cs="Calibri"/>
+          <w:sz w:val="24"/>
+        </w:rPr>
+        <w:t xml:space="preserve">In Anlage 12 wird nun auch der </w:t>
+      </w:r>
+      <w:proofErr w:type="spellStart"/>
+      <w:r>
+        <w:rPr>
+          <w:rFonts w:ascii="Calibri" w:eastAsia="Calibri" w:hAnsi="Calibri" w:cs="Calibri"/>
+          <w:sz w:val="24"/>
+        </w:rPr>
+        <w:t>stv</w:t>
+      </w:r>
+      <w:proofErr w:type="spellEnd"/>
+      <w:r>
+        <w:rPr>
+          <w:rFonts w:ascii="Calibri" w:eastAsia="Calibri" w:hAnsi="Calibri" w:cs="Calibri"/>
+          <w:sz w:val="24"/>
+        </w:rPr>
+        <w:t>. Beratungslehrer ausgegeben, sofern in der INI-Datei eingestellt.</w:t>
+      </w:r>
+    </w:p>
+    <w:p>
+      <w:pPr>
+        <w:rPr>
+          <w:rFonts w:ascii="Calibri" w:eastAsia="Calibri" w:hAnsi="Calibri" w:cs="Calibri"/>
+          <w:b/>
+          <w:sz w:val="24"/>
+        </w:rPr>
+      </w:pPr>
+      <w:r>
+        <w:rPr>
+          <w:rFonts w:ascii="Calibri" w:eastAsia="Calibri" w:hAnsi="Calibri" w:cs="Calibri"/>
+          <w:b/>
+          <w:sz w:val="24"/>
+        </w:rPr>
+        <w:t>19.12.2021</w:t>
+      </w:r>
+    </w:p>
+    <w:p>
+      <w:pPr>
+        <w:rPr>
+          <w:rFonts w:ascii="Calibri" w:eastAsia="Calibri" w:hAnsi="Calibri" w:cs="Calibri"/>
+          <w:sz w:val="24"/>
+        </w:rPr>
+      </w:pPr>
+      <w:r>
+        <w:rPr>
+          <w:rFonts w:ascii="Calibri" w:eastAsia="Calibri" w:hAnsi="Calibri" w:cs="Calibri"/>
+          <w:sz w:val="24"/>
+        </w:rPr>
+        <w:t>Die Zeugnisse und Bescheide der Sekundarstufe II, die in den Anlagen der APO-</w:t>
+      </w:r>
+      <w:proofErr w:type="spellStart"/>
+      <w:r>
+        <w:rPr>
+          <w:rFonts w:ascii="Calibri" w:eastAsia="Calibri" w:hAnsi="Calibri" w:cs="Calibri"/>
+          <w:sz w:val="24"/>
+        </w:rPr>
+        <w:t>GOSt</w:t>
+      </w:r>
+      <w:proofErr w:type="spellEnd"/>
+      <w:r>
+        <w:rPr>
+          <w:rFonts w:ascii="Calibri" w:eastAsia="Calibri" w:hAnsi="Calibri" w:cs="Calibri"/>
+          <w:sz w:val="24"/>
+        </w:rPr>
+        <w:t xml:space="preserve"> enthalten sind, wurden aus verschiedenen Formularpaketen in einem eigenständigen Paket gebündelt. Daraus resultiert die hier neu begonnene Versionsgeschichte.</w:t>
+      </w:r>
+    </w:p>
+    <w:p>
+      <w:pPr>
+        <w:rPr>
+          <w:rFonts w:ascii="Calibri" w:eastAsia="Calibri" w:hAnsi="Calibri" w:cs="Calibri"/>
+          <w:sz w:val="24"/>
+        </w:rPr>
+      </w:pPr>
+      <w:r>
+        <w:rPr>
+          <w:rFonts w:ascii="Calibri" w:eastAsia="Calibri" w:hAnsi="Calibri" w:cs="Calibri"/>
+          <w:sz w:val="24"/>
+        </w:rPr>
+        <w:t>Dabei wurden die folgenden größeren Änderungen vorgenommen.</w:t>
+      </w:r>
+    </w:p>
+    <w:p>
+      <w:pPr>
+        <w:numPr>
+          <w:ilvl w:val="0"/>
+          <w:numId w:val="8"/>
+        </w:numPr>
+        <w:ind w:left="360" w:hanging="360"/>
+        <w:rPr>
+          <w:rFonts w:ascii="Calibri" w:eastAsia="Calibri" w:hAnsi="Calibri" w:cs="Calibri"/>
+          <w:sz w:val="24"/>
+        </w:rPr>
+      </w:pPr>
+      <w:r>
+        <w:rPr>
+          <w:rFonts w:ascii="Calibri" w:eastAsia="Calibri" w:hAnsi="Calibri" w:cs="Calibri"/>
+          <w:sz w:val="24"/>
+        </w:rPr>
+        <w:t xml:space="preserve">Die Zeugnisse sind nun durch INI-Dateien konfigurierbar. Dieses Format unterscheidet sich zum Teil in seinen Einstellungen von den INI-Dateien der Zeugnisse für die </w:t>
+      </w:r>
+      <w:r>
+        <w:rPr>
+          <w:rFonts w:ascii="Calibri" w:eastAsia="Calibri" w:hAnsi="Calibri" w:cs="Calibri"/>
+          <w:sz w:val="24"/>
+        </w:rPr>
         <w:lastRenderedPageBreak/>
-        <w:t>Anpassung des Parameters „K“ für die Quelle des Infoblocks in den Anlagen 10, 11, 17 und 18. Dort werden nun auch zusätzlich die Zeilenbeschriftungen des Infoblocks ausgeblendet.</w:t>
-      </w:r>
-    </w:p>
-    <w:p>
-      <w:pPr>
-        <w:numPr>
-          <w:ilvl w:val="0"/>
-          <w:numId w:val="6"/>
-        </w:numPr>
-        <w:ind w:left="720" w:hanging="360"/>
-        <w:rPr>
-          <w:rFonts w:ascii="Calibri" w:eastAsia="Calibri" w:hAnsi="Calibri" w:cs="Calibri"/>
-          <w:sz w:val="24"/>
-        </w:rPr>
-      </w:pPr>
-      <w:r>
-        <w:rPr>
-          <w:rFonts w:ascii="Calibri" w:eastAsia="Calibri" w:hAnsi="Calibri" w:cs="Calibri"/>
-          <w:sz w:val="24"/>
-        </w:rPr>
-        <w:t>Korrekturen an der Formatierung und den Abständen auf den Seiten 2 und 3 der Anlage 12. Betroffenen waren die Überschriften der Aufgabenfelder, Vertiefungs- und Projektkurse und die besondere Lernleistung, insbesondere bei mehrzeiligen Themen.</w:t>
-      </w:r>
-    </w:p>
-    <w:p>
-      <w:pPr>
-        <w:rPr>
-          <w:rFonts w:ascii="Calibri" w:eastAsia="Calibri" w:hAnsi="Calibri" w:cs="Calibri"/>
-          <w:b/>
-          <w:sz w:val="24"/>
-        </w:rPr>
-      </w:pPr>
-      <w:r>
-        <w:rPr>
-          <w:rFonts w:ascii="Calibri" w:eastAsia="Calibri" w:hAnsi="Calibri" w:cs="Calibri"/>
-          <w:b/>
-          <w:sz w:val="24"/>
-        </w:rPr>
-        <w:t>04.04.2022</w:t>
-      </w:r>
-    </w:p>
-    <w:p>
-      <w:pPr>
-        <w:numPr>
-          <w:ilvl w:val="0"/>
-          <w:numId w:val="7"/>
-        </w:numPr>
-        <w:ind w:left="720" w:hanging="360"/>
-        <w:rPr>
-          <w:rFonts w:ascii="Calibri" w:eastAsia="Calibri" w:hAnsi="Calibri" w:cs="Calibri"/>
-          <w:sz w:val="24"/>
-        </w:rPr>
-      </w:pPr>
-      <w:r>
-        <w:rPr>
-          <w:rFonts w:ascii="Calibri" w:eastAsia="Calibri" w:hAnsi="Calibri" w:cs="Calibri"/>
-          <w:sz w:val="24"/>
-        </w:rPr>
-        <w:t>Fehlerkorrekturen bei der Ausgabe der Jahrgangsstufen an einer Gesamtschule in den Anlagen 7 und 16a</w:t>
-      </w:r>
-    </w:p>
-    <w:p>
-      <w:pPr>
-        <w:numPr>
-          <w:ilvl w:val="0"/>
-          <w:numId w:val="7"/>
-        </w:numPr>
-        <w:ind w:left="720" w:hanging="360"/>
-        <w:rPr>
-          <w:rFonts w:ascii="Calibri" w:eastAsia="Calibri" w:hAnsi="Calibri" w:cs="Calibri"/>
-          <w:sz w:val="24"/>
-        </w:rPr>
-      </w:pPr>
-      <w:r>
-        <w:rPr>
-          <w:rFonts w:ascii="Calibri" w:eastAsia="Calibri" w:hAnsi="Calibri" w:cs="Calibri"/>
-          <w:sz w:val="24"/>
-        </w:rPr>
-        <w:t>Fehlerkorrekturen der Fußnoten in den Anlagen 3, 4, 7 und 12</w:t>
-      </w:r>
-    </w:p>
-    <w:p>
-      <w:pPr>
-        <w:numPr>
-          <w:ilvl w:val="0"/>
-          <w:numId w:val="7"/>
-        </w:numPr>
-        <w:ind w:left="720" w:hanging="360"/>
-        <w:rPr>
-          <w:rFonts w:ascii="Calibri" w:eastAsia="Calibri" w:hAnsi="Calibri" w:cs="Calibri"/>
-          <w:sz w:val="24"/>
-        </w:rPr>
-      </w:pPr>
-      <w:r>
-        <w:rPr>
-          <w:rFonts w:ascii="Calibri" w:eastAsia="Calibri" w:hAnsi="Calibri" w:cs="Calibri"/>
-          <w:sz w:val="24"/>
-        </w:rPr>
-        <w:t>Fehlerkorrektur der Erkennung volljähriger Schülerinnen und Schüler in den Anlagen 10, 11, 17, 18</w:t>
-      </w:r>
-    </w:p>
-    <w:p>
-      <w:pPr>
-        <w:numPr>
-          <w:ilvl w:val="0"/>
-          <w:numId w:val="7"/>
-        </w:numPr>
-        <w:ind w:left="720" w:hanging="360"/>
-        <w:rPr>
-          <w:rFonts w:ascii="Calibri" w:eastAsia="Calibri" w:hAnsi="Calibri" w:cs="Calibri"/>
-          <w:sz w:val="24"/>
-        </w:rPr>
-      </w:pPr>
-      <w:r>
-        <w:rPr>
-          <w:rFonts w:ascii="Calibri" w:eastAsia="Calibri" w:hAnsi="Calibri" w:cs="Calibri"/>
-          <w:sz w:val="24"/>
-        </w:rPr>
-        <w:t>Fehlerkorrektur der Zeilenumbrüche in der INI-Datei</w:t>
-      </w:r>
-    </w:p>
-    <w:p>
-      <w:pPr>
-        <w:numPr>
-          <w:ilvl w:val="0"/>
-          <w:numId w:val="7"/>
-        </w:numPr>
-        <w:ind w:left="720" w:hanging="360"/>
-        <w:rPr>
-          <w:rFonts w:ascii="Calibri" w:eastAsia="Calibri" w:hAnsi="Calibri" w:cs="Calibri"/>
-          <w:sz w:val="24"/>
-        </w:rPr>
-      </w:pPr>
-      <w:r>
-        <w:rPr>
-          <w:rFonts w:ascii="Calibri" w:eastAsia="Calibri" w:hAnsi="Calibri" w:cs="Calibri"/>
-          <w:sz w:val="24"/>
-        </w:rPr>
-        <w:t>Anpassung der Standard-INI-Werte auf N für UnterschriftenMitStvKlassenlehrer  und ZeugnisMitRand. Ebenso wird ZeugnisdatumQuelle auf I gesetzt für Anlagen 5b, 10, 11, 17, 18</w:t>
-      </w:r>
-    </w:p>
-    <w:p>
-      <w:pPr>
-        <w:numPr>
-          <w:ilvl w:val="0"/>
-          <w:numId w:val="7"/>
-        </w:numPr>
-        <w:ind w:left="720" w:hanging="360"/>
-        <w:rPr>
-          <w:rFonts w:ascii="Calibri" w:eastAsia="Calibri" w:hAnsi="Calibri" w:cs="Calibri"/>
-          <w:sz w:val="24"/>
-        </w:rPr>
-      </w:pPr>
-      <w:r>
-        <w:rPr>
-          <w:rFonts w:ascii="Calibri" w:eastAsia="Calibri" w:hAnsi="Calibri" w:cs="Calibri"/>
-          <w:sz w:val="24"/>
-        </w:rPr>
-        <w:t>In allen Anlagen wurden die Unterschriftenfunktionen erweitert. So kann jetzt in der INI ein senkrechter Strich „|“ in die Unterschriftentexte eingefügt werden, der als Zeilenumbruch beim Ausdruck interpretiert wird.</w:t>
-      </w:r>
-    </w:p>
-    <w:p>
-      <w:pPr>
-        <w:numPr>
-          <w:ilvl w:val="0"/>
-          <w:numId w:val="7"/>
-        </w:numPr>
-        <w:ind w:left="720" w:hanging="360"/>
-        <w:rPr>
-          <w:rFonts w:ascii="Calibri" w:eastAsia="Calibri" w:hAnsi="Calibri" w:cs="Calibri"/>
-          <w:sz w:val="24"/>
-        </w:rPr>
-      </w:pPr>
-      <w:r>
-        <w:rPr>
-          <w:rFonts w:ascii="Calibri" w:eastAsia="Calibri" w:hAnsi="Calibri" w:cs="Calibri"/>
-          <w:sz w:val="24"/>
-        </w:rPr>
-        <w:t>Für die Unterschriftenquelle des ZAA-Vorsitzes wurde der alte INI-Parameterwert „I“ durch „T“ ersetzt und damit die gleiche Funktionalität implementiert wie beim Beratungslehrer (Abfragebox und Eingabemöglichkeit eines Lehrerkürzels).</w:t>
-      </w:r>
-    </w:p>
-    <w:p>
-      <w:pPr>
-        <w:numPr>
-          <w:ilvl w:val="0"/>
-          <w:numId w:val="7"/>
-        </w:numPr>
-        <w:ind w:left="720" w:hanging="360"/>
-        <w:rPr>
-          <w:rFonts w:ascii="Calibri" w:eastAsia="Calibri" w:hAnsi="Calibri" w:cs="Calibri"/>
-          <w:sz w:val="24"/>
-        </w:rPr>
-      </w:pPr>
-      <w:r>
-        <w:rPr>
-          <w:rFonts w:ascii="Calibri" w:eastAsia="Calibri" w:hAnsi="Calibri" w:cs="Calibri"/>
-          <w:sz w:val="24"/>
-        </w:rPr>
-        <w:t>In Anlage 12 wird nun auch der stv. Beratungslehrer ausgegeben, sofern in der INI-Datei eingestellt.</w:t>
-      </w:r>
-    </w:p>
-    <w:p>
-      <w:pPr>
-        <w:rPr>
-          <w:rFonts w:ascii="Calibri" w:eastAsia="Calibri" w:hAnsi="Calibri" w:cs="Calibri"/>
-          <w:b/>
-          <w:sz w:val="24"/>
-        </w:rPr>
-      </w:pPr>
-      <w:r>
-        <w:rPr>
-          <w:rFonts w:ascii="Calibri" w:eastAsia="Calibri" w:hAnsi="Calibri" w:cs="Calibri"/>
-          <w:b/>
-          <w:sz w:val="24"/>
-        </w:rPr>
-        <w:t>19.12.2021</w:t>
-      </w:r>
-    </w:p>
-    <w:p>
-      <w:pPr>
-        <w:rPr>
-          <w:rFonts w:ascii="Calibri" w:eastAsia="Calibri" w:hAnsi="Calibri" w:cs="Calibri"/>
-          <w:sz w:val="24"/>
-        </w:rPr>
-      </w:pPr>
-      <w:r>
-        <w:rPr>
-          <w:rFonts w:ascii="Calibri" w:eastAsia="Calibri" w:hAnsi="Calibri" w:cs="Calibri"/>
-          <w:sz w:val="24"/>
-        </w:rPr>
-        <w:t>Die Zeugnisse und Bescheide der Sekundarstufe II, die in den Anlagen der APO-GOSt enthalten sind, wurden aus verschiedenen Formularpaketen in einem eigenständigen Paket gebündelt. Daraus resultiert die hier neu begonnene Versionsgeschichte.</w:t>
-      </w:r>
-    </w:p>
-    <w:p>
-      <w:pPr>
-        <w:rPr>
-          <w:rFonts w:ascii="Calibri" w:eastAsia="Calibri" w:hAnsi="Calibri" w:cs="Calibri"/>
-          <w:sz w:val="24"/>
-        </w:rPr>
-      </w:pPr>
-      <w:r>
-        <w:rPr>
-          <w:rFonts w:ascii="Calibri" w:eastAsia="Calibri" w:hAnsi="Calibri" w:cs="Calibri"/>
-          <w:sz w:val="24"/>
-        </w:rPr>
-        <w:t>Dabei wurden die folgenden größeren Änderungen vorgenommen.</w:t>
-      </w:r>
-    </w:p>
-    <w:p>
-      <w:pPr>
-        <w:numPr>
-          <w:ilvl w:val="0"/>
-          <w:numId w:val="8"/>
-        </w:numPr>
-        <w:ind w:left="360" w:hanging="360"/>
-        <w:rPr>
-          <w:rFonts w:ascii="Calibri" w:eastAsia="Calibri" w:hAnsi="Calibri" w:cs="Calibri"/>
-          <w:sz w:val="24"/>
-        </w:rPr>
-      </w:pPr>
-      <w:r>
-        <w:rPr>
-          <w:rFonts w:ascii="Calibri" w:eastAsia="Calibri" w:hAnsi="Calibri" w:cs="Calibri"/>
-          <w:sz w:val="24"/>
-        </w:rPr>
-        <w:t>Die Zeugnisse sind nun durch INI-Dateien konfigurierbar. Dieses Format unterscheidet sich zum Teil in seinen Einstellungen von den INI-Dateien der Zeugnisse für die Sekundarstufe I.</w:t>
+        <w:t>Sekundarstufe I.</w:t>
       </w:r>
       <w:r>
         <w:rPr>
@@ -672,17 +901,7 @@
             <w:sz w:val="24"/>
             <w:u w:val="single"/>
           </w:rPr>
-          <w:t xml:space="preserve">https://www.youtube.com/watch?v=OkoujJ2SlL0 HYPERLINK "https://www.youtube.com/watch?v=OkoujJ2SlL0&amp;t=77s" HYPERLINK "https://www.youtube.com/watch?v=OkoujJ2SlL0 HYPERLINK "https://www.youtube.com/watch?v=OkoujJ2SlL0&amp;t=77s"&amp; HYPERLINK "https://www.youtube.com/watch?v=OkoujJ2SlL0&amp;t=77s"t=77s" HYPERLINK </w:t>
-        </w:r>
-        <w:r>
-          <w:rPr>
-            <w:rFonts w:ascii="Calibri" w:eastAsia="Calibri" w:hAnsi="Calibri" w:cs="Calibri"/>
-            <w:color w:val="0563C1"/>
-            <w:sz w:val="24"/>
-            <w:u w:val="single"/>
-          </w:rPr>
-          <w:lastRenderedPageBreak/>
-          <w:t>"https://www.youtube.com/watch?v=OkoujJ2SlL0&amp;t=77s"&amp; HYPERLINK "https://www.youtube.com/watch?v=OkoujJ2SlL0&amp;t=77s" HYPERLINK "https://www.youtube.com/watch?v=OkoujJ2SlL0 HYPERLINK "https://www.youtube.com/watch?v=OkoujJ2SlL0&amp;t=77s"&amp; HYPERLINK "https://www.youtube.com/watch?v=OkoujJ2SlL0&amp;t=77s"t=77s" HYPERLINK "https://www.youtube.com/watch?v=OkoujJ2SlL0&amp;t=77s"t=77s</w:t>
+          <w:t>https://www.youtube.com/watch?v=OkoujJ2SlL0 HYPERLINK "https://www.youtube.com/watch?v=OkoujJ2SlL0&amp;t=77s" HYPERLINK "https://www.youtube.com/watch?v=OkoujJ2SlL0 HYPERLINK "https://www.youtube.com/watch?v=OkoujJ2SlL0&amp;t=77s"&amp; HYPERLINK "https://www.youtube.com/watch?v=OkoujJ2SlL0&amp;t=77s"t=77s" HYPERLINK "https://www.youtube.com/watch?v=OkoujJ2SlL0&amp;t=77s"&amp; HYPERLINK "https://www.youtube.com/watch?v=OkoujJ2SlL0&amp;t=77s" HYPERLINK "https://www.youtube.com/watch?v=OkoujJ2SlL0 HYPERLINK "https://www.youtube.com/watch?v=OkoujJ2SlL0&amp;t=77s"&amp; HYPERLINK "https://www.youtube.com/watch?v=OkoujJ2SlL0&amp;t=77s"t=77s" HYPERLINK "https://www.youtube.com/watch?v=OkoujJ2SlL0&amp;t=77s"t=77s</w:t>
         </w:r>
       </w:hyperlink>
     </w:p>
@@ -743,7 +962,23 @@
           <w:rFonts w:ascii="Calibri" w:eastAsia="Calibri" w:hAnsi="Calibri" w:cs="Calibri"/>
           <w:sz w:val="24"/>
         </w:rPr>
-        <w:t>Die Versionierung finden Sie im Report unter den Global &gt; Deklarations &gt; Constants.</w:t>
+        <w:t xml:space="preserve">Die Versionierung finden Sie im Report unter den Global &gt; </w:t>
+      </w:r>
+      <w:proofErr w:type="spellStart"/>
+      <w:r>
+        <w:rPr>
+          <w:rFonts w:ascii="Calibri" w:eastAsia="Calibri" w:hAnsi="Calibri" w:cs="Calibri"/>
+          <w:sz w:val="24"/>
+        </w:rPr>
+        <w:t>Deklarations</w:t>
+      </w:r>
+      <w:proofErr w:type="spellEnd"/>
+      <w:r>
+        <w:rPr>
+          <w:rFonts w:ascii="Calibri" w:eastAsia="Calibri" w:hAnsi="Calibri" w:cs="Calibri"/>
+          <w:sz w:val="24"/>
+        </w:rPr>
+        <w:t xml:space="preserve"> &gt; Constants.</w:t>
       </w:r>
     </w:p>
     <w:p>
@@ -857,7 +1092,7 @@
 </file>
 
 <file path=word/numbering.xml><?xml version="1.0" encoding="utf-8"?>
-<w:numbering xmlns:wpc="http://schemas.microsoft.com/office/word/2010/wordprocessingCanvas" xmlns:cx="http://schemas.microsoft.com/office/drawing/2014/chartex" xmlns:cx1="http://schemas.microsoft.com/office/drawing/2015/9/8/chartex" xmlns:cx2="http://schemas.microsoft.com/office/drawing/2015/10/21/chartex" xmlns:cx3="http://schemas.microsoft.com/office/drawing/2016/5/9/chartex" xmlns:cx4="http://schemas.microsoft.com/office/drawing/2016/5/10/chartex" xmlns:cx5="http://schemas.microsoft.com/office/drawing/2016/5/11/chartex" xmlns:cx6="http://schemas.microsoft.com/office/drawing/2016/5/12/chartex" xmlns:cx7="http://schemas.microsoft.com/office/drawing/2016/5/13/chartex" xmlns:cx8="http://schemas.microsoft.com/office/drawing/2016/5/14/chartex" xmlns:mc="http://schemas.openxmlformats.org/markup-compatibility/2006" xmlns:aink="http://schemas.microsoft.com/office/drawing/2016/ink" xmlns:am3d="http://schemas.microsoft.com/office/drawing/2017/model3d" xmlns:o="urn:schemas-microsoft-com:office:office" xmlns:oel="http://schemas.microsoft.com/office/2019/extlst" xmlns:r="http://schemas.openxmlformats.org/officeDocument/2006/relationships" xmlns:m="http://schemas.openxmlformats.org/officeDocument/2006/math" xmlns:v="urn:schemas-microsoft-com:vml" xmlns:wp14="http://schemas.microsoft.com/office/word/2010/wordprocessingDrawing" xmlns:wp="http://schemas.openxmlformats.org/drawingml/2006/wordprocessingDrawing" xmlns:w10="urn:schemas-microsoft-com:office:word" xmlns:w="http://schemas.openxmlformats.org/wordprocessingml/2006/main" xmlns:w14="http://schemas.microsoft.com/office/word/2010/wordml" xmlns:w15="http://schemas.microsoft.com/office/word/2012/wordml" xmlns:w16cex="http://schemas.microsoft.com/office/word/2018/wordml/cex" xmlns:w16cid="http://schemas.microsoft.com/office/word/2016/wordml/cid" xmlns:w16="http://schemas.microsoft.com/office/word/2018/wordml" xmlns:w16sdtdh="http://schemas.microsoft.com/office/word/2020/wordml/sdtdatahash" xmlns:w16se="http://schemas.microsoft.com/office/word/2015/wordml/symex" xmlns:wpg="http://schemas.microsoft.com/office/word/2010/wordprocessingGroup" xmlns:wpi="http://schemas.microsoft.com/office/word/2010/wordprocessingInk" xmlns:wne="http://schemas.microsoft.com/office/word/2006/wordml" xmlns:wps="http://schemas.microsoft.com/office/word/2010/wordprocessingShape" mc:Ignorable="w14 w15 w16se w16cid w16 w16cex w16sdtdh wp14">
+<w:numbering xmlns:wpc="http://schemas.microsoft.com/office/word/2010/wordprocessingCanvas" xmlns:cx="http://schemas.microsoft.com/office/drawing/2014/chartex" xmlns:cx1="http://schemas.microsoft.com/office/drawing/2015/9/8/chartex" xmlns:cx2="http://schemas.microsoft.com/office/drawing/2015/10/21/chartex" xmlns:cx3="http://schemas.microsoft.com/office/drawing/2016/5/9/chartex" xmlns:cx4="http://schemas.microsoft.com/office/drawing/2016/5/10/chartex" xmlns:cx5="http://schemas.microsoft.com/office/drawing/2016/5/11/chartex" xmlns:cx6="http://schemas.microsoft.com/office/drawing/2016/5/12/chartex" xmlns:cx7="http://schemas.microsoft.com/office/drawing/2016/5/13/chartex" xmlns:cx8="http://schemas.microsoft.com/office/drawing/2016/5/14/chartex" xmlns:mc="http://schemas.openxmlformats.org/markup-compatibility/2006" xmlns:aink="http://schemas.microsoft.com/office/drawing/2016/ink" xmlns:am3d="http://schemas.microsoft.com/office/drawing/2017/model3d" xmlns:o="urn:schemas-microsoft-com:office:office" xmlns:oel="http://schemas.microsoft.com/office/2019/extlst" xmlns:r="http://schemas.openxmlformats.org/officeDocument/2006/relationships" xmlns:m="http://schemas.openxmlformats.org/officeDocument/2006/math" xmlns:v="urn:schemas-microsoft-com:vml" xmlns:wp14="http://schemas.microsoft.com/office/word/2010/wordprocessingDrawing" xmlns:wp="http://schemas.openxmlformats.org/drawingml/2006/wordprocessingDrawing" xmlns:w10="urn:schemas-microsoft-com:office:word" xmlns:w="http://schemas.openxmlformats.org/wordprocessingml/2006/main" xmlns:w14="http://schemas.microsoft.com/office/word/2010/wordml" xmlns:w15="http://schemas.microsoft.com/office/word/2012/wordml" xmlns:w16cex="http://schemas.microsoft.com/office/word/2018/wordml/cex" xmlns:w16cid="http://schemas.microsoft.com/office/word/2016/wordml/cid" xmlns:w16="http://schemas.microsoft.com/office/word/2018/wordml" xmlns:w16du="http://schemas.microsoft.com/office/word/2023/wordml/word16du" xmlns:w16sdtdh="http://schemas.microsoft.com/office/word/2020/wordml/sdtdatahash" xmlns:w16sdtfl="http://schemas.microsoft.com/office/word/2024/wordml/sdtformatlock" xmlns:w16se="http://schemas.microsoft.com/office/word/2015/wordml/symex" xmlns:wpg="http://schemas.microsoft.com/office/word/2010/wordprocessingGroup" xmlns:wpi="http://schemas.microsoft.com/office/word/2010/wordprocessingInk" xmlns:wne="http://schemas.microsoft.com/office/word/2006/wordml" xmlns:wps="http://schemas.microsoft.com/office/word/2010/wordprocessingShape" mc:Ignorable="w14 w15 w16se w16cid w16 w16cex w16sdtdh w16sdtfl w16du wp14">
   <w:abstractNum w:abstractNumId="0" w15:restartNumberingAfterBreak="0">
     <w:nsid w:val="11BE5AD4"/>
     <w:multiLevelType w:val="multilevel"/>
@@ -1063,6 +1298,119 @@
     </w:lvl>
   </w:abstractNum>
   <w:abstractNum w:abstractNumId="4" w15:restartNumberingAfterBreak="0">
+    <w:nsid w:val="40A11667"/>
+    <w:multiLevelType w:val="hybridMultilevel"/>
+    <w:tmpl w:val="54DE282C"/>
+    <w:lvl w:ilvl="0" w:tplc="04070001">
+      <w:start w:val="1"/>
+      <w:numFmt w:val="bullet"/>
+      <w:lvlText w:val=""/>
+      <w:lvlJc w:val="left"/>
+      <w:pPr>
+        <w:ind w:left="720" w:hanging="360"/>
+      </w:pPr>
+      <w:rPr>
+        <w:rFonts w:ascii="Symbol" w:hAnsi="Symbol" w:hint="default"/>
+      </w:rPr>
+    </w:lvl>
+    <w:lvl w:ilvl="1" w:tplc="04070003" w:tentative="1">
+      <w:start w:val="1"/>
+      <w:numFmt w:val="bullet"/>
+      <w:lvlText w:val="o"/>
+      <w:lvlJc w:val="left"/>
+      <w:pPr>
+        <w:ind w:left="1440" w:hanging="360"/>
+      </w:pPr>
+      <w:rPr>
+        <w:rFonts w:ascii="Courier New" w:hAnsi="Courier New" w:cs="Courier New" w:hint="default"/>
+      </w:rPr>
+    </w:lvl>
+    <w:lvl w:ilvl="2" w:tplc="04070005" w:tentative="1">
+      <w:start w:val="1"/>
+      <w:numFmt w:val="bullet"/>
+      <w:lvlText w:val=""/>
+      <w:lvlJc w:val="left"/>
+      <w:pPr>
+        <w:ind w:left="2160" w:hanging="360"/>
+      </w:pPr>
+      <w:rPr>
+        <w:rFonts w:ascii="Wingdings" w:hAnsi="Wingdings" w:hint="default"/>
+      </w:rPr>
+    </w:lvl>
+    <w:lvl w:ilvl="3" w:tplc="04070001" w:tentative="1">
+      <w:start w:val="1"/>
+      <w:numFmt w:val="bullet"/>
+      <w:lvlText w:val=""/>
+      <w:lvlJc w:val="left"/>
+      <w:pPr>
+        <w:ind w:left="2880" w:hanging="360"/>
+      </w:pPr>
+      <w:rPr>
+        <w:rFonts w:ascii="Symbol" w:hAnsi="Symbol" w:hint="default"/>
+      </w:rPr>
+    </w:lvl>
+    <w:lvl w:ilvl="4" w:tplc="04070003" w:tentative="1">
+      <w:start w:val="1"/>
+      <w:numFmt w:val="bullet"/>
+      <w:lvlText w:val="o"/>
+      <w:lvlJc w:val="left"/>
+      <w:pPr>
+        <w:ind w:left="3600" w:hanging="360"/>
+      </w:pPr>
+      <w:rPr>
+        <w:rFonts w:ascii="Courier New" w:hAnsi="Courier New" w:cs="Courier New" w:hint="default"/>
+      </w:rPr>
+    </w:lvl>
+    <w:lvl w:ilvl="5" w:tplc="04070005" w:tentative="1">
+      <w:start w:val="1"/>
+      <w:numFmt w:val="bullet"/>
+      <w:lvlText w:val=""/>
+      <w:lvlJc w:val="left"/>
+      <w:pPr>
+        <w:ind w:left="4320" w:hanging="360"/>
+      </w:pPr>
+      <w:rPr>
+        <w:rFonts w:ascii="Wingdings" w:hAnsi="Wingdings" w:hint="default"/>
+      </w:rPr>
+    </w:lvl>
+    <w:lvl w:ilvl="6" w:tplc="04070001" w:tentative="1">
+      <w:start w:val="1"/>
+      <w:numFmt w:val="bullet"/>
+      <w:lvlText w:val=""/>
+      <w:lvlJc w:val="left"/>
+      <w:pPr>
+        <w:ind w:left="5040" w:hanging="360"/>
+      </w:pPr>
+      <w:rPr>
+        <w:rFonts w:ascii="Symbol" w:hAnsi="Symbol" w:hint="default"/>
+      </w:rPr>
+    </w:lvl>
+    <w:lvl w:ilvl="7" w:tplc="04070003" w:tentative="1">
+      <w:start w:val="1"/>
+      <w:numFmt w:val="bullet"/>
+      <w:lvlText w:val="o"/>
+      <w:lvlJc w:val="left"/>
+      <w:pPr>
+        <w:ind w:left="5760" w:hanging="360"/>
+      </w:pPr>
+      <w:rPr>
+        <w:rFonts w:ascii="Courier New" w:hAnsi="Courier New" w:cs="Courier New" w:hint="default"/>
+      </w:rPr>
+    </w:lvl>
+    <w:lvl w:ilvl="8" w:tplc="04070005" w:tentative="1">
+      <w:start w:val="1"/>
+      <w:numFmt w:val="bullet"/>
+      <w:lvlText w:val=""/>
+      <w:lvlJc w:val="left"/>
+      <w:pPr>
+        <w:ind w:left="6480" w:hanging="360"/>
+      </w:pPr>
+      <w:rPr>
+        <w:rFonts w:ascii="Wingdings" w:hAnsi="Wingdings" w:hint="default"/>
+      </w:rPr>
+    </w:lvl>
+  </w:abstractNum>
+  <w:abstractNum w:abstractNumId="5" w15:restartNumberingAfterBreak="0">
     <w:nsid w:val="46001FE4"/>
     <w:multiLevelType w:val="multilevel"/>
     <w:tmpl w:val="3C6EB83A"/>
@@ -1113,7 +1461,7 @@
       <w:lvlJc w:val="left"/>
     </w:lvl>
   </w:abstractNum>
-  <w:abstractNum w:abstractNumId="5" w15:restartNumberingAfterBreak="0">
+  <w:abstractNum w:abstractNumId="6" w15:restartNumberingAfterBreak="0">
     <w:nsid w:val="6D9D5C81"/>
     <w:multiLevelType w:val="multilevel"/>
     <w:tmpl w:val="26DE6D36"/>
@@ -1164,7 +1512,7 @@
       <w:lvlJc w:val="left"/>
     </w:lvl>
   </w:abstractNum>
-  <w:abstractNum w:abstractNumId="6" w15:restartNumberingAfterBreak="0">
+  <w:abstractNum w:abstractNumId="7" w15:restartNumberingAfterBreak="0">
     <w:nsid w:val="78A9407C"/>
     <w:multiLevelType w:val="multilevel"/>
     <w:tmpl w:val="177AE56A"/>
@@ -1215,7 +1563,7 @@
       <w:lvlJc w:val="left"/>
     </w:lvl>
   </w:abstractNum>
-  <w:abstractNum w:abstractNumId="7" w15:restartNumberingAfterBreak="0">
+  <w:abstractNum w:abstractNumId="8" w15:restartNumberingAfterBreak="0">
     <w:nsid w:val="7D4338C7"/>
     <w:multiLevelType w:val="multilevel"/>
     <w:tmpl w:val="EF7E59BA"/>
@@ -1270,19 +1618,19 @@
     <w:abstractNumId w:val="0"/>
   </w:num>
   <w:num w:numId="2" w16cid:durableId="751850763">
-    <w:abstractNumId w:val="7"/>
+    <w:abstractNumId w:val="8"/>
   </w:num>
   <w:num w:numId="3" w16cid:durableId="1664551487">
-    <w:abstractNumId w:val="5"/>
+    <w:abstractNumId w:val="6"/>
   </w:num>
   <w:num w:numId="4" w16cid:durableId="1356273193">
-    <w:abstractNumId w:val="4"/>
+    <w:abstractNumId w:val="5"/>
   </w:num>
   <w:num w:numId="5" w16cid:durableId="1143346999">
     <w:abstractNumId w:val="3"/>
   </w:num>
   <w:num w:numId="6" w16cid:durableId="451437883">
-    <w:abstractNumId w:val="6"/>
+    <w:abstractNumId w:val="7"/>
   </w:num>
   <w:num w:numId="7" w16cid:durableId="1127896975">
     <w:abstractNumId w:val="2"/>
@@ -1290,11 +1638,14 @@
   <w:num w:numId="8" w16cid:durableId="501821607">
     <w:abstractNumId w:val="1"/>
   </w:num>
+  <w:num w:numId="9" w16cid:durableId="1713651217">
+    <w:abstractNumId w:val="4"/>
+  </w:num>
 </w:numbering>
 </file>
 
 <file path=word/styles.xml><?xml version="1.0" encoding="utf-8"?>
-<w:styles xmlns:mc="http://schemas.openxmlformats.org/markup-compatibility/2006" xmlns:r="http://schemas.openxmlformats.org/officeDocument/2006/relationships" xmlns:w="http://schemas.openxmlformats.org/wordprocessingml/2006/main" xmlns:w14="http://schemas.microsoft.com/office/word/2010/wordml" xmlns:w15="http://schemas.microsoft.com/office/word/2012/wordml" xmlns:w16cex="http://schemas.microsoft.com/office/word/2018/wordml/cex" xmlns:w16cid="http://schemas.microsoft.com/office/word/2016/wordml/cid" xmlns:w16="http://schemas.microsoft.com/office/word/2018/wordml" xmlns:w16sdtdh="http://schemas.microsoft.com/office/word/2020/wordml/sdtdatahash" xmlns:w16se="http://schemas.microsoft.com/office/word/2015/wordml/symex" mc:Ignorable="w14 w15 w16se w16cid w16 w16cex w16sdtdh">
+<w:styles xmlns:mc="http://schemas.openxmlformats.org/markup-compatibility/2006" xmlns:r="http://schemas.openxmlformats.org/officeDocument/2006/relationships" xmlns:w="http://schemas.openxmlformats.org/wordprocessingml/2006/main" xmlns:w14="http://schemas.microsoft.com/office/word/2010/wordml" xmlns:w15="http://schemas.microsoft.com/office/word/2012/wordml" xmlns:w16cex="http://schemas.microsoft.com/office/word/2018/wordml/cex" xmlns:w16cid="http://schemas.microsoft.com/office/word/2016/wordml/cid" xmlns:w16="http://schemas.microsoft.com/office/word/2018/wordml" xmlns:w16du="http://schemas.microsoft.com/office/word/2023/wordml/word16du" xmlns:w16sdtdh="http://schemas.microsoft.com/office/word/2020/wordml/sdtdatahash" xmlns:w16sdtfl="http://schemas.microsoft.com/office/word/2024/wordml/sdtformatlock" xmlns:w16se="http://schemas.microsoft.com/office/word/2015/wordml/symex" mc:Ignorable="w14 w15 w16se w16cid w16 w16cex w16sdtdh w16sdtfl w16du">
   <w:docDefaults>
     <w:rPrDefault>
       <w:rPr>
@@ -1694,10 +2045,30 @@
     <w:name w:val="Normal"/>
     <w:qFormat/>
   </w:style>
+  <w:style w:type="paragraph" w:styleId="berschrift1">
+    <w:name w:val="heading 1"/>
+    <w:basedOn w:val="Standard"/>
+    <w:next w:val="Standard"/>
+    <w:link w:val="berschrift1Zchn"/>
+    <w:uiPriority w:val="9"/>
+    <w:qFormat/>
+    <w:rsid w:val="00316447"/>
+    <w:pPr>
+      <w:keepNext/>
+      <w:keepLines/>
+      <w:spacing w:before="240" w:after="0"/>
+      <w:outlineLvl w:val="0"/>
+    </w:pPr>
+    <w:rPr>
+      <w:rFonts w:asciiTheme="majorHAnsi" w:eastAsiaTheme="majorEastAsia" w:hAnsiTheme="majorHAnsi" w:cstheme="majorBidi"/>
+      <w:color w:val="2F5496" w:themeColor="accent1" w:themeShade="BF"/>
+      <w:sz w:val="32"/>
+      <w:szCs w:val="32"/>
+    </w:rPr>
+  </w:style>
   <w:style w:type="character" w:default="1" w:styleId="Absatz-Standardschriftart">
     <w:name w:val="Default Paragraph Font"/>
     <w:uiPriority w:val="1"/>
-    <w:semiHidden/>
     <w:unhideWhenUsed/>
   </w:style>
   <w:style w:type="table" w:default="1" w:styleId="NormaleTabelle">
@@ -1720,6 +2091,30 @@
     <w:uiPriority w:val="99"/>
     <w:semiHidden/>
     <w:unhideWhenUsed/>
+  </w:style>
+  <w:style w:type="paragraph" w:styleId="Listenabsatz">
+    <w:name w:val="List Paragraph"/>
+    <w:basedOn w:val="Standard"/>
+    <w:uiPriority w:val="34"/>
+    <w:qFormat/>
+    <w:rsid w:val="00A2703F"/>
+    <w:pPr>
+      <w:ind w:left="720"/>
+      <w:contextualSpacing/>
+    </w:pPr>
+  </w:style>
+  <w:style w:type="character" w:customStyle="1" w:styleId="berschrift1Zchn">
+    <w:name w:val="Überschrift 1 Zchn"/>
+    <w:basedOn w:val="Absatz-Standardschriftart"/>
+    <w:link w:val="berschrift1"/>
+    <w:uiPriority w:val="9"/>
+    <w:rsid w:val="00316447"/>
+    <w:rPr>
+      <w:rFonts w:asciiTheme="majorHAnsi" w:eastAsiaTheme="majorEastAsia" w:hAnsiTheme="majorHAnsi" w:cstheme="majorBidi"/>
+      <w:color w:val="2F5496" w:themeColor="accent1" w:themeShade="BF"/>
+      <w:sz w:val="32"/>
+      <w:szCs w:val="32"/>
+    </w:rPr>
   </w:style>
 </w:styles>
 </file>

</xml_diff>